<commit_message>
added comments to code and some images
</commit_message>
<xml_diff>
--- a/C++/Intermediate/Threading/serialVsParallel/ParallelCPP-stdthreadAndCUDA.docx
+++ b/C++/Intermediate/Threading/serialVsParallel/ParallelCPP-stdthreadAndCUDA.docx
@@ -562,6 +562,37 @@
     </w:p>
     <w:p>
       <w:pPr>
+        <w:pStyle w:val="Heading4"/>
+        <w:numPr>
+          <w:ilvl w:val="3"/>
+          <w:numId w:val="1"/>
+        </w:numPr>
+        <w:ind w:hanging="0" w:start="0"/>
+        <w:rPr/>
+      </w:pPr>
+      <w:r>
+        <w:rPr/>
+        <w:t>Feel free to play around with these examples! Try modifying vector</w:t>
+      </w:r>
+      <w:r>
+        <w:rPr/>
+        <w:t>s</w:t>
+      </w:r>
+      <w:r>
+        <w:rPr/>
+        <w:t>, matr</w:t>
+      </w:r>
+      <w:r>
+        <w:rPr/>
+        <w:t>ice</w:t>
+      </w:r>
+      <w:r>
+        <w:rPr/>
+        <w:t>, threads, grids, blocks, etc. Note that you may have to reboot your machine if you get too fancy!</w:t>
+      </w:r>
+    </w:p>
+    <w:p>
+      <w:pPr>
         <w:pStyle w:val="Heading2"/>
         <w:numPr>
           <w:ilvl w:val="1"/>
@@ -852,6 +883,43 @@
     </w:p>
     <w:p>
       <w:pPr>
+        <w:pStyle w:val="BodyText"/>
+        <w:rPr>
+          <w:b/>
+          <w:bCs/>
+        </w:rPr>
+      </w:pPr>
+      <w:r>
+        <w:rPr>
+          <w:b/>
+          <w:bCs/>
+        </w:rPr>
+        <w:t xml:space="preserve">Note: this one can take a while </w:t>
+      </w:r>
+      <w:r>
+        <w:rPr>
+          <w:b/>
+          <w:bCs/>
+        </w:rPr>
+        <w:t>on a slow machine</w:t>
+      </w:r>
+      <w:r>
+        <w:rPr>
+          <w:b/>
+          <w:bCs/>
+        </w:rPr>
+        <w:t xml:space="preserve">! </w:t>
+      </w:r>
+      <w:r>
+        <w:rPr>
+          <w:b/>
+          <w:bCs/>
+        </w:rPr>
+        <w:t>You may end up having to decrease the sample size.</w:t>
+      </w:r>
+    </w:p>
+    <w:p>
+      <w:pPr>
         <w:pStyle w:val="Heading4"/>
         <w:numPr>
           <w:ilvl w:val="3"/>
@@ -1875,10 +1943,860 @@
         <w:pStyle w:val="BodyText"/>
         <w:spacing w:before="0" w:after="140"/>
         <w:ind w:hanging="0" w:start="0" w:end="0"/>
-        <w:rPr/>
-      </w:pPr>
-      <w:r>
-        <w:rPr/>
+        <w:rPr>
+          <w:b/>
+          <w:bCs/>
+        </w:rPr>
+      </w:pPr>
+      <w:r>
+        <w:rPr>
+          <w:b/>
+          <w:bCs/>
+        </w:rPr>
+        <w:t>TODO: Explain CUDA blocks and grids</w:t>
+      </w:r>
+    </w:p>
+    <w:p>
+      <w:pPr>
+        <w:pStyle w:val="Heading2"/>
+        <w:numPr>
+          <w:ilvl w:val="1"/>
+          <w:numId w:val="2"/>
+        </w:numPr>
+        <w:ind w:hanging="0" w:start="0"/>
+        <w:rPr/>
+      </w:pPr>
+      <w:r>
+        <w:rPr/>
+        <w:t>TODO: The CUDA Hierarchy</w:t>
+      </w:r>
+    </w:p>
+    <w:p>
+      <w:pPr>
+        <w:pStyle w:val="BodyText"/>
+        <w:numPr>
+          <w:ilvl w:val="0"/>
+          <w:numId w:val="0"/>
+        </w:numPr>
+        <w:ind w:hanging="0" w:start="1080"/>
+        <w:rPr/>
+      </w:pPr>
+      <w:r>
+        <w:rPr>
+          <w:rStyle w:val="Strong"/>
+        </w:rPr>
+        <w:t>Thread</w:t>
+      </w:r>
+      <w:r>
+        <w:rPr/>
+        <w:t xml:space="preserve"> The smallest unit of execution. Each thread runs the kernel code on one piece of data (for example, one pixel or one matrix element).</w:t>
+      </w:r>
+    </w:p>
+    <w:p>
+      <w:pPr>
+        <w:pStyle w:val="BodyText"/>
+        <w:numPr>
+          <w:ilvl w:val="0"/>
+          <w:numId w:val="0"/>
+        </w:numPr>
+        <w:ind w:hanging="0" w:start="0" w:end="0"/>
+        <w:rPr/>
+      </w:pPr>
+      <w:r>
+        <w:rPr>
+          <w:rStyle w:val="Strong"/>
+        </w:rPr>
+        <w:t>Block</w:t>
+      </w:r>
+      <w:r>
+        <w:rPr/>
+        <w:t xml:space="preserve"> A group of threads. Threads inside a block can cooperate by sharing data in </w:t>
+      </w:r>
+      <w:r>
+        <w:rPr>
+          <w:rStyle w:val="Strong"/>
+        </w:rPr>
+        <w:t>shared memory</w:t>
+      </w:r>
+      <w:r>
+        <w:rPr/>
+        <w:t xml:space="preserve"> and synchronizing with each other.</w:t>
+      </w:r>
+    </w:p>
+    <w:p>
+      <w:pPr>
+        <w:pStyle w:val="BodyText"/>
+        <w:numPr>
+          <w:ilvl w:val="1"/>
+          <w:numId w:val="13"/>
+        </w:numPr>
+        <w:tabs>
+          <w:tab w:val="clear" w:pos="709"/>
+          <w:tab w:val="left" w:pos="0" w:leader="none"/>
+        </w:tabs>
+        <w:ind w:hanging="283" w:start="1418" w:end="0"/>
+        <w:rPr/>
+      </w:pPr>
+      <w:r>
+        <w:rPr/>
+        <w:t>Blocks are usually 1D, 2D, or 3D arrays of threads.</w:t>
+      </w:r>
+    </w:p>
+    <w:p>
+      <w:pPr>
+        <w:pStyle w:val="BodyText"/>
+        <w:numPr>
+          <w:ilvl w:val="1"/>
+          <w:numId w:val="13"/>
+        </w:numPr>
+        <w:tabs>
+          <w:tab w:val="clear" w:pos="709"/>
+          <w:tab w:val="left" w:pos="0" w:leader="none"/>
+        </w:tabs>
+        <w:ind w:hanging="283" w:start="1418" w:end="0"/>
+        <w:rPr/>
+      </w:pPr>
+      <w:r>
+        <w:rPr/>
+        <w:t xml:space="preserve">Example: </w:t>
+      </w:r>
+      <w:r>
+        <w:rPr>
+          <w:rStyle w:val="SourceText"/>
+        </w:rPr>
+        <w:t>dim3 threadsPerBlock(16, 16)</w:t>
+      </w:r>
+      <w:r>
+        <w:rPr/>
+        <w:t xml:space="preserve"> → a block with 256 threads arranged in a 16×16 grid.</w:t>
+      </w:r>
+    </w:p>
+    <w:p>
+      <w:pPr>
+        <w:pStyle w:val="BodyText"/>
+        <w:numPr>
+          <w:ilvl w:val="0"/>
+          <w:numId w:val="0"/>
+        </w:numPr>
+        <w:ind w:hanging="0" w:start="0" w:end="0"/>
+        <w:rPr/>
+      </w:pPr>
+      <w:r>
+        <w:rPr>
+          <w:rStyle w:val="Strong"/>
+        </w:rPr>
+        <w:t>Grid</w:t>
+      </w:r>
+      <w:r>
+        <w:rPr/>
+        <w:t xml:space="preserve"> A collection of blocks. The grid defines the overall shape of the computation.</w:t>
+      </w:r>
+    </w:p>
+    <w:p>
+      <w:pPr>
+        <w:pStyle w:val="BodyText"/>
+        <w:numPr>
+          <w:ilvl w:val="1"/>
+          <w:numId w:val="13"/>
+        </w:numPr>
+        <w:tabs>
+          <w:tab w:val="clear" w:pos="709"/>
+          <w:tab w:val="left" w:pos="0" w:leader="none"/>
+        </w:tabs>
+        <w:ind w:hanging="283" w:start="1418" w:end="0"/>
+        <w:rPr/>
+      </w:pPr>
+      <w:r>
+        <w:rPr/>
+        <w:t>Grids can also be 1D, 2D, or 3D arrays of blocks.</w:t>
+      </w:r>
+    </w:p>
+    <w:p>
+      <w:pPr>
+        <w:pStyle w:val="BodyText"/>
+        <w:numPr>
+          <w:ilvl w:val="1"/>
+          <w:numId w:val="13"/>
+        </w:numPr>
+        <w:tabs>
+          <w:tab w:val="clear" w:pos="709"/>
+          <w:tab w:val="left" w:pos="0" w:leader="none"/>
+        </w:tabs>
+        <w:ind w:hanging="283" w:start="1418" w:end="0"/>
+        <w:rPr/>
+      </w:pPr>
+      <w:r>
+        <w:rPr/>
+        <w:t xml:space="preserve">Example: </w:t>
+      </w:r>
+      <w:r>
+        <w:rPr>
+          <w:rStyle w:val="SourceText"/>
+        </w:rPr>
+        <w:t>dim3 numBlocks(64, 64)</w:t>
+      </w:r>
+      <w:r>
+        <w:rPr/>
+        <w:t xml:space="preserve"> → a grid with 4096 blocks.</w:t>
+      </w:r>
+    </w:p>
+    <w:p>
+      <w:pPr>
+        <w:pStyle w:val="Heading3"/>
+        <w:numPr>
+          <w:ilvl w:val="2"/>
+          <w:numId w:val="1"/>
+        </w:numPr>
+        <w:ind w:hanging="0" w:start="0"/>
+        <w:rPr/>
+      </w:pPr>
+      <w:r>
+        <w:rPr/>
+        <w:t>How threads are identified</w:t>
+      </w:r>
+    </w:p>
+    <w:p>
+      <w:pPr>
+        <w:pStyle w:val="BodyText"/>
+        <w:ind w:hanging="0" w:start="0" w:end="0"/>
+        <w:rPr/>
+      </w:pPr>
+      <w:r>
+        <w:rPr/>
+        <w:t xml:space="preserve">Each thread has a </w:t>
+      </w:r>
+      <w:r>
+        <w:rPr>
+          <w:rStyle w:val="Strong"/>
+        </w:rPr>
+        <w:t>unique global ID</w:t>
+      </w:r>
+      <w:r>
+        <w:rPr/>
+        <w:t xml:space="preserve"> computed from its block and thread indices:</w:t>
+      </w:r>
+    </w:p>
+    <w:p>
+      <w:pPr>
+        <w:pStyle w:val="PreformattedText"/>
+        <w:ind w:hanging="0" w:start="0" w:end="0"/>
+        <w:rPr/>
+      </w:pPr>
+      <w:r>
+        <w:rPr>
+          <w:rStyle w:val="SourceText"/>
+        </w:rPr>
+        <w:t>int globalX = blockIdx.x * blockDim.x + threadIdx.x;</w:t>
+      </w:r>
+    </w:p>
+    <w:p>
+      <w:pPr>
+        <w:pStyle w:val="PreformattedText"/>
+        <w:spacing w:before="0" w:after="283"/>
+        <w:ind w:hanging="0" w:start="0" w:end="0"/>
+        <w:rPr/>
+      </w:pPr>
+      <w:r>
+        <w:rPr>
+          <w:rStyle w:val="SourceText"/>
+        </w:rPr>
+        <w:t>int globalY = blockIdx.y * blockDim.y + threadIdx.y;</w:t>
+      </w:r>
+    </w:p>
+    <w:p>
+      <w:pPr>
+        <w:pStyle w:val="BodyText"/>
+        <w:numPr>
+          <w:ilvl w:val="0"/>
+          <w:numId w:val="14"/>
+        </w:numPr>
+        <w:tabs>
+          <w:tab w:val="clear" w:pos="709"/>
+          <w:tab w:val="left" w:pos="0" w:leader="none"/>
+        </w:tabs>
+        <w:ind w:hanging="283" w:start="709" w:end="0"/>
+        <w:rPr/>
+      </w:pPr>
+      <w:r>
+        <w:rPr>
+          <w:rStyle w:val="SourceText"/>
+        </w:rPr>
+        <w:t>threadIdx</w:t>
+      </w:r>
+      <w:r>
+        <w:rPr/>
+        <w:t>: thread’s index inside its block</w:t>
+      </w:r>
+    </w:p>
+    <w:p>
+      <w:pPr>
+        <w:pStyle w:val="BodyText"/>
+        <w:numPr>
+          <w:ilvl w:val="0"/>
+          <w:numId w:val="14"/>
+        </w:numPr>
+        <w:tabs>
+          <w:tab w:val="clear" w:pos="709"/>
+          <w:tab w:val="left" w:pos="0" w:leader="none"/>
+        </w:tabs>
+        <w:ind w:hanging="283" w:start="709" w:end="0"/>
+        <w:rPr/>
+      </w:pPr>
+      <w:r>
+        <w:rPr>
+          <w:rStyle w:val="SourceText"/>
+        </w:rPr>
+        <w:t>blockIdx</w:t>
+      </w:r>
+      <w:r>
+        <w:rPr/>
+        <w:t>: block’s index inside the grid</w:t>
+      </w:r>
+    </w:p>
+    <w:p>
+      <w:pPr>
+        <w:pStyle w:val="BodyText"/>
+        <w:numPr>
+          <w:ilvl w:val="0"/>
+          <w:numId w:val="14"/>
+        </w:numPr>
+        <w:tabs>
+          <w:tab w:val="clear" w:pos="709"/>
+          <w:tab w:val="left" w:pos="0" w:leader="none"/>
+        </w:tabs>
+        <w:ind w:hanging="283" w:start="709" w:end="0"/>
+        <w:rPr/>
+      </w:pPr>
+      <w:r>
+        <w:rPr>
+          <w:rStyle w:val="SourceText"/>
+        </w:rPr>
+        <w:t>blockDim</w:t>
+      </w:r>
+      <w:r>
+        <w:rPr/>
+        <w:t>: number of threads per block</w:t>
+      </w:r>
+    </w:p>
+    <w:p>
+      <w:pPr>
+        <w:pStyle w:val="BodyText"/>
+        <w:numPr>
+          <w:ilvl w:val="0"/>
+          <w:numId w:val="14"/>
+        </w:numPr>
+        <w:tabs>
+          <w:tab w:val="clear" w:pos="709"/>
+          <w:tab w:val="left" w:pos="0" w:leader="none"/>
+        </w:tabs>
+        <w:ind w:hanging="283" w:start="709" w:end="0"/>
+        <w:rPr/>
+      </w:pPr>
+      <w:r>
+        <w:rPr>
+          <w:rStyle w:val="SourceText"/>
+        </w:rPr>
+        <w:t>gridDim</w:t>
+      </w:r>
+      <w:r>
+        <w:rPr/>
+        <w:t>: number of blocks per grid</w:t>
+      </w:r>
+    </w:p>
+    <w:p>
+      <w:pPr>
+        <w:pStyle w:val="BodyText"/>
+        <w:ind w:hanging="0" w:start="0" w:end="0"/>
+        <w:rPr/>
+      </w:pPr>
+      <w:r>
+        <w:rPr/>
+        <w:t>This mapping lets you assign each thread to a specific element in your data structure (like a pixel in an image or an entry in a matrix).</w:t>
+      </w:r>
+    </w:p>
+    <w:p>
+      <w:pPr>
+        <w:pStyle w:val="BodyText"/>
+        <w:ind w:hanging="0" w:start="0" w:end="0"/>
+        <w:rPr/>
+      </w:pPr>
+      <w:r>
+        <w:rPr/>
+        <w:drawing>
+          <wp:anchor behindDoc="0" distT="0" distB="0" distL="0" distR="0" simplePos="0" locked="0" layoutInCell="0" allowOverlap="1" relativeHeight="4">
+            <wp:simplePos x="0" y="0"/>
+            <wp:positionH relativeFrom="column">
+              <wp:align>center</wp:align>
+            </wp:positionH>
+            <wp:positionV relativeFrom="paragraph">
+              <wp:posOffset>635</wp:posOffset>
+            </wp:positionV>
+            <wp:extent cx="6120130" cy="2768600"/>
+            <wp:effectExtent l="0" t="0" r="0" b="0"/>
+            <wp:wrapSquare wrapText="largest"/>
+            <wp:docPr id="2" name="Image4" descr="" title=""/>
+            <wp:cNvGraphicFramePr>
+              <a:graphicFrameLocks xmlns:a="http://schemas.openxmlformats.org/drawingml/2006/main" noChangeAspect="1"/>
+            </wp:cNvGraphicFramePr>
+            <a:graphic xmlns:a="http://schemas.openxmlformats.org/drawingml/2006/main">
+              <a:graphicData uri="http://schemas.openxmlformats.org/drawingml/2006/picture">
+                <pic:pic xmlns:pic="http://schemas.openxmlformats.org/drawingml/2006/picture">
+                  <pic:nvPicPr>
+                    <pic:cNvPr id="2" name="Image4" descr="" title=""/>
+                    <pic:cNvPicPr>
+                      <a:picLocks noChangeAspect="1" noChangeArrowheads="1"/>
+                    </pic:cNvPicPr>
+                  </pic:nvPicPr>
+                  <pic:blipFill>
+                    <a:blip r:embed="rId18"/>
+                    <a:stretch>
+                      <a:fillRect/>
+                    </a:stretch>
+                  </pic:blipFill>
+                  <pic:spPr bwMode="auto">
+                    <a:xfrm>
+                      <a:off x="0" y="0"/>
+                      <a:ext cx="6120130" cy="2768600"/>
+                    </a:xfrm>
+                    <a:prstGeom prst="rect">
+                      <a:avLst/>
+                    </a:prstGeom>
+                  </pic:spPr>
+                </pic:pic>
+              </a:graphicData>
+            </a:graphic>
+          </wp:anchor>
+        </w:drawing>
+      </w:r>
+    </w:p>
+    <w:p>
+      <w:pPr>
+        <w:pStyle w:val="BodyText"/>
+        <w:ind w:hanging="0" w:start="0" w:end="0"/>
+        <w:rPr/>
+      </w:pPr>
+      <w:r>
+        <w:rPr/>
+      </w:r>
+    </w:p>
+    <w:p>
+      <w:pPr>
+        <w:pStyle w:val="BodyText"/>
+        <w:ind w:hanging="0" w:start="0" w:end="0"/>
+        <w:rPr/>
+      </w:pPr>
+      <w:r>
+        <w:rPr/>
+      </w:r>
+    </w:p>
+    <w:p>
+      <w:pPr>
+        <w:pStyle w:val="BodyText"/>
+        <w:ind w:hanging="0" w:start="0" w:end="0"/>
+        <w:rPr/>
+      </w:pPr>
+      <w:r>
+        <w:rPr/>
+      </w:r>
+    </w:p>
+    <w:p>
+      <w:pPr>
+        <w:pStyle w:val="Heading3"/>
+        <w:numPr>
+          <w:ilvl w:val="2"/>
+          <w:numId w:val="1"/>
+        </w:numPr>
+        <w:ind w:hanging="0" w:start="0"/>
+        <w:rPr/>
+      </w:pPr>
+      <w:r>
+        <w:rPr/>
+        <w:t>Example: 1000×1000 matrix multiplication</w:t>
+      </w:r>
+    </w:p>
+    <w:p>
+      <w:pPr>
+        <w:pStyle w:val="BodyText"/>
+        <w:numPr>
+          <w:ilvl w:val="0"/>
+          <w:numId w:val="16"/>
+        </w:numPr>
+        <w:tabs>
+          <w:tab w:val="clear" w:pos="709"/>
+          <w:tab w:val="left" w:pos="0" w:leader="none"/>
+        </w:tabs>
+        <w:ind w:hanging="283" w:start="709" w:end="0"/>
+        <w:rPr/>
+      </w:pPr>
+      <w:r>
+        <w:rPr>
+          <w:rStyle w:val="Strong"/>
+        </w:rPr>
+        <w:t>Threads per block</w:t>
+      </w:r>
+      <w:r>
+        <w:rPr/>
+        <w:t xml:space="preserve">: </w:t>
+      </w:r>
+      <w:r>
+        <w:rPr>
+          <w:rStyle w:val="SourceText"/>
+        </w:rPr>
+        <w:t>(16, 16)</w:t>
+      </w:r>
+      <w:r>
+        <w:rPr/>
+        <w:t xml:space="preserve"> </w:t>
+      </w:r>
+      <w:r>
+        <w:rPr/>
+        <w:t xml:space="preserve">= </w:t>
+      </w:r>
+      <w:r>
+        <w:rPr/>
+        <w:t>256 threads per block</w:t>
+      </w:r>
+    </w:p>
+    <w:p>
+      <w:pPr>
+        <w:pStyle w:val="BodyText"/>
+        <w:numPr>
+          <w:ilvl w:val="0"/>
+          <w:numId w:val="16"/>
+        </w:numPr>
+        <w:tabs>
+          <w:tab w:val="clear" w:pos="709"/>
+          <w:tab w:val="left" w:pos="0" w:leader="none"/>
+        </w:tabs>
+        <w:ind w:hanging="283" w:start="709" w:end="0"/>
+        <w:rPr/>
+      </w:pPr>
+      <w:r>
+        <w:rPr>
+          <w:rStyle w:val="Strong"/>
+        </w:rPr>
+        <w:t>Blocks per grid</w:t>
+      </w:r>
+      <w:r>
+        <w:rPr/>
+        <w:t xml:space="preserve">: </w:t>
+      </w:r>
+      <w:r>
+        <w:rPr>
+          <w:rStyle w:val="SourceText"/>
+        </w:rPr>
+        <w:t>(63, 63)</w:t>
+      </w:r>
+      <w:r>
+        <w:rPr/>
+        <w:t xml:space="preserve"> </w:t>
+      </w:r>
+      <w:r>
+        <w:rPr/>
+        <w:t>=</w:t>
+      </w:r>
+      <w:r>
+        <w:rPr/>
+        <w:t xml:space="preserve"> enough blocks to cover 1000×1000 elements</w:t>
+      </w:r>
+    </w:p>
+    <w:p>
+      <w:pPr>
+        <w:pStyle w:val="BodyText"/>
+        <w:numPr>
+          <w:ilvl w:val="0"/>
+          <w:numId w:val="16"/>
+        </w:numPr>
+        <w:tabs>
+          <w:tab w:val="clear" w:pos="709"/>
+          <w:tab w:val="left" w:pos="0" w:leader="none"/>
+        </w:tabs>
+        <w:ind w:hanging="283" w:start="709" w:end="0"/>
+        <w:rPr/>
+      </w:pPr>
+      <w:r>
+        <w:rPr>
+          <w:rStyle w:val="Strong"/>
+        </w:rPr>
+        <w:t>Total threads launched</w:t>
+      </w:r>
+      <w:r>
+        <w:rPr/>
+        <w:t xml:space="preserve">: </w:t>
+      </w:r>
+      <w:r>
+        <w:rPr>
+          <w:rStyle w:val="SourceText"/>
+        </w:rPr>
+        <w:t>63*16 × 63*16 ≈ 1,016,064</w:t>
+      </w:r>
+      <w:r>
+        <w:rPr/>
+        <w:t xml:space="preserve"> threads</w:t>
+      </w:r>
+    </w:p>
+    <w:p>
+      <w:pPr>
+        <w:pStyle w:val="BodyText"/>
+        <w:ind w:hanging="0" w:start="0" w:end="0"/>
+        <w:rPr/>
+      </w:pPr>
+      <w:r>
+        <w:rPr/>
+        <w:t>Each thread computes one element of the result matrix.</w:t>
+      </w:r>
+    </w:p>
+    <w:p>
+      <w:pPr>
+        <w:pStyle w:val="Heading2"/>
+        <w:numPr>
+          <w:ilvl w:val="1"/>
+          <w:numId w:val="2"/>
+        </w:numPr>
+        <w:ind w:hanging="0" w:start="0"/>
+        <w:rPr/>
+      </w:pPr>
+      <w:r>
+        <w:rPr/>
+        <w:t xml:space="preserve">These images may </w:t>
+      </w:r>
+      <w:r>
+        <w:rPr/>
+        <w:t>also assist in visualization</w:t>
+      </w:r>
+      <w:r>
+        <w:rPr/>
+        <w:t>:</w:t>
+      </w:r>
+    </w:p>
+    <w:p>
+      <w:pPr>
+        <w:pStyle w:val="BodyText"/>
+        <w:rPr/>
+      </w:pPr>
+      <w:r>
+        <w:rPr/>
+      </w:r>
+    </w:p>
+    <w:p>
+      <w:pPr>
+        <w:pStyle w:val="Heading3"/>
+        <w:numPr>
+          <w:ilvl w:val="0"/>
+          <w:numId w:val="0"/>
+        </w:numPr>
+        <w:rPr/>
+      </w:pPr>
+      <w:r>
+        <w:rPr/>
+        <w:drawing>
+          <wp:anchor behindDoc="0" distT="0" distB="0" distL="0" distR="0" simplePos="0" locked="0" layoutInCell="0" allowOverlap="1" relativeHeight="3">
+            <wp:simplePos x="0" y="0"/>
+            <wp:positionH relativeFrom="column">
+              <wp:align>center</wp:align>
+            </wp:positionH>
+            <wp:positionV relativeFrom="paragraph">
+              <wp:posOffset>635</wp:posOffset>
+            </wp:positionV>
+            <wp:extent cx="4063365" cy="3047365"/>
+            <wp:effectExtent l="0" t="0" r="0" b="0"/>
+            <wp:wrapSquare wrapText="largest"/>
+            <wp:docPr id="3" name="Image3" descr="" title=""/>
+            <wp:cNvGraphicFramePr>
+              <a:graphicFrameLocks xmlns:a="http://schemas.openxmlformats.org/drawingml/2006/main" noChangeAspect="1"/>
+            </wp:cNvGraphicFramePr>
+            <a:graphic xmlns:a="http://schemas.openxmlformats.org/drawingml/2006/main">
+              <a:graphicData uri="http://schemas.openxmlformats.org/drawingml/2006/picture">
+                <pic:pic xmlns:pic="http://schemas.openxmlformats.org/drawingml/2006/picture">
+                  <pic:nvPicPr>
+                    <pic:cNvPr id="3" name="Image3" descr="" title=""/>
+                    <pic:cNvPicPr>
+                      <a:picLocks noChangeAspect="1" noChangeArrowheads="1"/>
+                    </pic:cNvPicPr>
+                  </pic:nvPicPr>
+                  <pic:blipFill>
+                    <a:blip r:embed="rId19"/>
+                    <a:stretch>
+                      <a:fillRect/>
+                    </a:stretch>
+                  </pic:blipFill>
+                  <pic:spPr bwMode="auto">
+                    <a:xfrm>
+                      <a:off x="0" y="0"/>
+                      <a:ext cx="4063365" cy="3047365"/>
+                    </a:xfrm>
+                    <a:prstGeom prst="rect">
+                      <a:avLst/>
+                    </a:prstGeom>
+                  </pic:spPr>
+                </pic:pic>
+              </a:graphicData>
+            </a:graphic>
+          </wp:anchor>
+        </w:drawing>
+      </w:r>
+    </w:p>
+    <w:p>
+      <w:pPr>
+        <w:pStyle w:val="BodyText"/>
+        <w:numPr>
+          <w:ilvl w:val="0"/>
+          <w:numId w:val="0"/>
+        </w:numPr>
+        <w:rPr/>
+      </w:pPr>
+      <w:r>
+        <w:rPr/>
+      </w:r>
+    </w:p>
+    <w:p>
+      <w:pPr>
+        <w:pStyle w:val="BodyText"/>
+        <w:numPr>
+          <w:ilvl w:val="0"/>
+          <w:numId w:val="0"/>
+        </w:numPr>
+        <w:rPr/>
+      </w:pPr>
+      <w:r>
+        <w:rPr/>
+      </w:r>
+    </w:p>
+    <w:p>
+      <w:pPr>
+        <w:pStyle w:val="BodyText"/>
+        <w:numPr>
+          <w:ilvl w:val="0"/>
+          <w:numId w:val="0"/>
+        </w:numPr>
+        <w:rPr/>
+      </w:pPr>
+      <w:r>
+        <w:rPr/>
+      </w:r>
+    </w:p>
+    <w:p>
+      <w:pPr>
+        <w:pStyle w:val="BodyText"/>
+        <w:numPr>
+          <w:ilvl w:val="0"/>
+          <w:numId w:val="0"/>
+        </w:numPr>
+        <w:rPr/>
+      </w:pPr>
+      <w:r>
+        <w:rPr/>
+      </w:r>
+    </w:p>
+    <w:p>
+      <w:pPr>
+        <w:pStyle w:val="BodyText"/>
+        <w:numPr>
+          <w:ilvl w:val="0"/>
+          <w:numId w:val="0"/>
+        </w:numPr>
+        <w:rPr/>
+      </w:pPr>
+      <w:r>
+        <w:rPr/>
+      </w:r>
+    </w:p>
+    <w:p>
+      <w:pPr>
+        <w:pStyle w:val="BodyText"/>
+        <w:numPr>
+          <w:ilvl w:val="0"/>
+          <w:numId w:val="0"/>
+        </w:numPr>
+        <w:rPr/>
+      </w:pPr>
+      <w:r>
+        <w:rPr/>
+      </w:r>
+    </w:p>
+    <w:p>
+      <w:pPr>
+        <w:pStyle w:val="BodyText"/>
+        <w:numPr>
+          <w:ilvl w:val="0"/>
+          <w:numId w:val="0"/>
+        </w:numPr>
+        <w:rPr/>
+      </w:pPr>
+      <w:r>
+        <w:rPr/>
+      </w:r>
+    </w:p>
+    <w:p>
+      <w:pPr>
+        <w:pStyle w:val="BodyText"/>
+        <w:numPr>
+          <w:ilvl w:val="0"/>
+          <w:numId w:val="0"/>
+        </w:numPr>
+        <w:rPr/>
+      </w:pPr>
+      <w:r>
+        <w:rPr/>
+      </w:r>
+    </w:p>
+    <w:p>
+      <w:pPr>
+        <w:pStyle w:val="BodyText"/>
+        <w:numPr>
+          <w:ilvl w:val="0"/>
+          <w:numId w:val="0"/>
+        </w:numPr>
+        <w:spacing w:before="0" w:after="140"/>
+        <w:rPr/>
+      </w:pPr>
+      <w:r>
+        <w:rPr/>
+        <w:drawing>
+          <wp:anchor behindDoc="0" distT="0" distB="0" distL="0" distR="0" simplePos="0" locked="0" layoutInCell="0" allowOverlap="1" relativeHeight="5">
+            <wp:simplePos x="0" y="0"/>
+            <wp:positionH relativeFrom="column">
+              <wp:align>center</wp:align>
+            </wp:positionH>
+            <wp:positionV relativeFrom="paragraph">
+              <wp:posOffset>635</wp:posOffset>
+            </wp:positionV>
+            <wp:extent cx="3758565" cy="4380865"/>
+            <wp:effectExtent l="0" t="0" r="0" b="0"/>
+            <wp:wrapSquare wrapText="largest"/>
+            <wp:docPr id="4" name="Image2" descr="" title=""/>
+            <wp:cNvGraphicFramePr>
+              <a:graphicFrameLocks xmlns:a="http://schemas.openxmlformats.org/drawingml/2006/main" noChangeAspect="1"/>
+            </wp:cNvGraphicFramePr>
+            <a:graphic xmlns:a="http://schemas.openxmlformats.org/drawingml/2006/main">
+              <a:graphicData uri="http://schemas.openxmlformats.org/drawingml/2006/picture">
+                <pic:pic xmlns:pic="http://schemas.openxmlformats.org/drawingml/2006/picture">
+                  <pic:nvPicPr>
+                    <pic:cNvPr id="4" name="Image2" descr="" title=""/>
+                    <pic:cNvPicPr>
+                      <a:picLocks noChangeAspect="1" noChangeArrowheads="1"/>
+                    </pic:cNvPicPr>
+                  </pic:nvPicPr>
+                  <pic:blipFill>
+                    <a:blip r:embed="rId20"/>
+                    <a:stretch>
+                      <a:fillRect/>
+                    </a:stretch>
+                  </pic:blipFill>
+                  <pic:spPr bwMode="auto">
+                    <a:xfrm>
+                      <a:off x="0" y="0"/>
+                      <a:ext cx="3758565" cy="4380865"/>
+                    </a:xfrm>
+                    <a:prstGeom prst="rect">
+                      <a:avLst/>
+                    </a:prstGeom>
+                  </pic:spPr>
+                </pic:pic>
+              </a:graphicData>
+            </a:graphic>
+          </wp:anchor>
+        </w:drawing>
       </w:r>
     </w:p>
     <w:sectPr>
@@ -3475,6 +4393,554 @@
     </w:lvl>
   </w:abstractNum>
   <w:abstractNum w:abstractNumId="13">
+    <w:lvl w:ilvl="0">
+      <w:start w:val="1"/>
+      <w:numFmt w:val="bullet"/>
+      <w:lvlText w:val=""/>
+      <w:lvlJc w:val="start"/>
+      <w:pPr>
+        <w:tabs>
+          <w:tab w:val="num" w:pos="709"/>
+        </w:tabs>
+        <w:ind w:start="709" w:hanging="283"/>
+      </w:pPr>
+      <w:rPr>
+        <w:rFonts w:ascii="Symbol" w:hAnsi="Symbol" w:cs="Symbol" w:hint="default"/>
+      </w:rPr>
+    </w:lvl>
+    <w:lvl w:ilvl="1">
+      <w:start w:val="1"/>
+      <w:numFmt w:val="bullet"/>
+      <w:lvlText w:val=""/>
+      <w:lvlJc w:val="start"/>
+      <w:pPr>
+        <w:tabs>
+          <w:tab w:val="num" w:pos="1418"/>
+        </w:tabs>
+        <w:ind w:start="1418" w:hanging="283"/>
+      </w:pPr>
+      <w:rPr>
+        <w:rFonts w:ascii="Symbol" w:hAnsi="Symbol" w:cs="Symbol" w:hint="default"/>
+      </w:rPr>
+    </w:lvl>
+    <w:lvl w:ilvl="2">
+      <w:start w:val="1"/>
+      <w:numFmt w:val="bullet"/>
+      <w:lvlText w:val=""/>
+      <w:lvlJc w:val="start"/>
+      <w:pPr>
+        <w:tabs>
+          <w:tab w:val="num" w:pos="2127"/>
+        </w:tabs>
+        <w:ind w:start="2127" w:hanging="283"/>
+      </w:pPr>
+      <w:rPr>
+        <w:rFonts w:ascii="Symbol" w:hAnsi="Symbol" w:cs="Symbol" w:hint="default"/>
+      </w:rPr>
+    </w:lvl>
+    <w:lvl w:ilvl="3">
+      <w:start w:val="1"/>
+      <w:numFmt w:val="bullet"/>
+      <w:lvlText w:val=""/>
+      <w:lvlJc w:val="start"/>
+      <w:pPr>
+        <w:tabs>
+          <w:tab w:val="num" w:pos="2836"/>
+        </w:tabs>
+        <w:ind w:start="2836" w:hanging="283"/>
+      </w:pPr>
+      <w:rPr>
+        <w:rFonts w:ascii="Symbol" w:hAnsi="Symbol" w:cs="Symbol" w:hint="default"/>
+      </w:rPr>
+    </w:lvl>
+    <w:lvl w:ilvl="4">
+      <w:start w:val="1"/>
+      <w:numFmt w:val="bullet"/>
+      <w:lvlText w:val=""/>
+      <w:lvlJc w:val="start"/>
+      <w:pPr>
+        <w:tabs>
+          <w:tab w:val="num" w:pos="3545"/>
+        </w:tabs>
+        <w:ind w:start="3545" w:hanging="283"/>
+      </w:pPr>
+      <w:rPr>
+        <w:rFonts w:ascii="Symbol" w:hAnsi="Symbol" w:cs="Symbol" w:hint="default"/>
+      </w:rPr>
+    </w:lvl>
+    <w:lvl w:ilvl="5">
+      <w:start w:val="1"/>
+      <w:numFmt w:val="bullet"/>
+      <w:lvlText w:val=""/>
+      <w:lvlJc w:val="start"/>
+      <w:pPr>
+        <w:tabs>
+          <w:tab w:val="num" w:pos="4254"/>
+        </w:tabs>
+        <w:ind w:start="4254" w:hanging="283"/>
+      </w:pPr>
+      <w:rPr>
+        <w:rFonts w:ascii="Symbol" w:hAnsi="Symbol" w:cs="Symbol" w:hint="default"/>
+      </w:rPr>
+    </w:lvl>
+    <w:lvl w:ilvl="6">
+      <w:start w:val="1"/>
+      <w:numFmt w:val="bullet"/>
+      <w:lvlText w:val=""/>
+      <w:lvlJc w:val="start"/>
+      <w:pPr>
+        <w:tabs>
+          <w:tab w:val="num" w:pos="4963"/>
+        </w:tabs>
+        <w:ind w:start="4963" w:hanging="283"/>
+      </w:pPr>
+      <w:rPr>
+        <w:rFonts w:ascii="Symbol" w:hAnsi="Symbol" w:cs="Symbol" w:hint="default"/>
+      </w:rPr>
+    </w:lvl>
+    <w:lvl w:ilvl="7">
+      <w:start w:val="1"/>
+      <w:numFmt w:val="bullet"/>
+      <w:lvlText w:val=""/>
+      <w:lvlJc w:val="start"/>
+      <w:pPr>
+        <w:tabs>
+          <w:tab w:val="num" w:pos="5672"/>
+        </w:tabs>
+        <w:ind w:start="5672" w:hanging="283"/>
+      </w:pPr>
+      <w:rPr>
+        <w:rFonts w:ascii="Symbol" w:hAnsi="Symbol" w:cs="Symbol" w:hint="default"/>
+      </w:rPr>
+    </w:lvl>
+    <w:lvl w:ilvl="8">
+      <w:start w:val="1"/>
+      <w:numFmt w:val="bullet"/>
+      <w:lvlText w:val=""/>
+      <w:lvlJc w:val="start"/>
+      <w:pPr>
+        <w:tabs>
+          <w:tab w:val="num" w:pos="6381"/>
+        </w:tabs>
+        <w:ind w:start="6381" w:hanging="283"/>
+      </w:pPr>
+      <w:rPr>
+        <w:rFonts w:ascii="Symbol" w:hAnsi="Symbol" w:cs="Symbol" w:hint="default"/>
+      </w:rPr>
+    </w:lvl>
+  </w:abstractNum>
+  <w:abstractNum w:abstractNumId="14">
+    <w:lvl w:ilvl="0">
+      <w:start w:val="1"/>
+      <w:numFmt w:val="bullet"/>
+      <w:lvlText w:val=""/>
+      <w:lvlJc w:val="start"/>
+      <w:pPr>
+        <w:tabs>
+          <w:tab w:val="num" w:pos="709"/>
+        </w:tabs>
+        <w:ind w:start="709" w:hanging="283"/>
+      </w:pPr>
+      <w:rPr>
+        <w:rFonts w:ascii="Symbol" w:hAnsi="Symbol" w:cs="Symbol" w:hint="default"/>
+      </w:rPr>
+    </w:lvl>
+    <w:lvl w:ilvl="1">
+      <w:start w:val="1"/>
+      <w:numFmt w:val="bullet"/>
+      <w:lvlText w:val=""/>
+      <w:lvlJc w:val="start"/>
+      <w:pPr>
+        <w:tabs>
+          <w:tab w:val="num" w:pos="1418"/>
+        </w:tabs>
+        <w:ind w:start="1418" w:hanging="283"/>
+      </w:pPr>
+      <w:rPr>
+        <w:rFonts w:ascii="Symbol" w:hAnsi="Symbol" w:cs="Symbol" w:hint="default"/>
+      </w:rPr>
+    </w:lvl>
+    <w:lvl w:ilvl="2">
+      <w:start w:val="1"/>
+      <w:numFmt w:val="bullet"/>
+      <w:lvlText w:val=""/>
+      <w:lvlJc w:val="start"/>
+      <w:pPr>
+        <w:tabs>
+          <w:tab w:val="num" w:pos="2127"/>
+        </w:tabs>
+        <w:ind w:start="2127" w:hanging="283"/>
+      </w:pPr>
+      <w:rPr>
+        <w:rFonts w:ascii="Symbol" w:hAnsi="Symbol" w:cs="Symbol" w:hint="default"/>
+      </w:rPr>
+    </w:lvl>
+    <w:lvl w:ilvl="3">
+      <w:start w:val="1"/>
+      <w:numFmt w:val="bullet"/>
+      <w:lvlText w:val=""/>
+      <w:lvlJc w:val="start"/>
+      <w:pPr>
+        <w:tabs>
+          <w:tab w:val="num" w:pos="2836"/>
+        </w:tabs>
+        <w:ind w:start="2836" w:hanging="283"/>
+      </w:pPr>
+      <w:rPr>
+        <w:rFonts w:ascii="Symbol" w:hAnsi="Symbol" w:cs="Symbol" w:hint="default"/>
+      </w:rPr>
+    </w:lvl>
+    <w:lvl w:ilvl="4">
+      <w:start w:val="1"/>
+      <w:numFmt w:val="bullet"/>
+      <w:lvlText w:val=""/>
+      <w:lvlJc w:val="start"/>
+      <w:pPr>
+        <w:tabs>
+          <w:tab w:val="num" w:pos="3545"/>
+        </w:tabs>
+        <w:ind w:start="3545" w:hanging="283"/>
+      </w:pPr>
+      <w:rPr>
+        <w:rFonts w:ascii="Symbol" w:hAnsi="Symbol" w:cs="Symbol" w:hint="default"/>
+      </w:rPr>
+    </w:lvl>
+    <w:lvl w:ilvl="5">
+      <w:start w:val="1"/>
+      <w:numFmt w:val="bullet"/>
+      <w:lvlText w:val=""/>
+      <w:lvlJc w:val="start"/>
+      <w:pPr>
+        <w:tabs>
+          <w:tab w:val="num" w:pos="4254"/>
+        </w:tabs>
+        <w:ind w:start="4254" w:hanging="283"/>
+      </w:pPr>
+      <w:rPr>
+        <w:rFonts w:ascii="Symbol" w:hAnsi="Symbol" w:cs="Symbol" w:hint="default"/>
+      </w:rPr>
+    </w:lvl>
+    <w:lvl w:ilvl="6">
+      <w:start w:val="1"/>
+      <w:numFmt w:val="bullet"/>
+      <w:lvlText w:val=""/>
+      <w:lvlJc w:val="start"/>
+      <w:pPr>
+        <w:tabs>
+          <w:tab w:val="num" w:pos="4963"/>
+        </w:tabs>
+        <w:ind w:start="4963" w:hanging="283"/>
+      </w:pPr>
+      <w:rPr>
+        <w:rFonts w:ascii="Symbol" w:hAnsi="Symbol" w:cs="Symbol" w:hint="default"/>
+      </w:rPr>
+    </w:lvl>
+    <w:lvl w:ilvl="7">
+      <w:start w:val="1"/>
+      <w:numFmt w:val="bullet"/>
+      <w:lvlText w:val=""/>
+      <w:lvlJc w:val="start"/>
+      <w:pPr>
+        <w:tabs>
+          <w:tab w:val="num" w:pos="5672"/>
+        </w:tabs>
+        <w:ind w:start="5672" w:hanging="283"/>
+      </w:pPr>
+      <w:rPr>
+        <w:rFonts w:ascii="Symbol" w:hAnsi="Symbol" w:cs="Symbol" w:hint="default"/>
+      </w:rPr>
+    </w:lvl>
+    <w:lvl w:ilvl="8">
+      <w:start w:val="1"/>
+      <w:numFmt w:val="bullet"/>
+      <w:lvlText w:val=""/>
+      <w:lvlJc w:val="start"/>
+      <w:pPr>
+        <w:tabs>
+          <w:tab w:val="num" w:pos="6381"/>
+        </w:tabs>
+        <w:ind w:start="6381" w:hanging="283"/>
+      </w:pPr>
+      <w:rPr>
+        <w:rFonts w:ascii="Symbol" w:hAnsi="Symbol" w:cs="Symbol" w:hint="default"/>
+      </w:rPr>
+    </w:lvl>
+  </w:abstractNum>
+  <w:abstractNum w:abstractNumId="15">
+    <w:lvl w:ilvl="0">
+      <w:start w:val="1"/>
+      <w:numFmt w:val="bullet"/>
+      <w:lvlText w:val=""/>
+      <w:lvlJc w:val="start"/>
+      <w:pPr>
+        <w:tabs>
+          <w:tab w:val="num" w:pos="720"/>
+        </w:tabs>
+        <w:ind w:start="720" w:hanging="360"/>
+      </w:pPr>
+      <w:rPr>
+        <w:rFonts w:ascii="Symbol" w:hAnsi="Symbol" w:cs="Symbol" w:hint="default"/>
+      </w:rPr>
+    </w:lvl>
+    <w:lvl w:ilvl="1">
+      <w:start w:val="1"/>
+      <w:numFmt w:val="bullet"/>
+      <w:lvlText w:val="◦"/>
+      <w:lvlJc w:val="start"/>
+      <w:pPr>
+        <w:tabs>
+          <w:tab w:val="num" w:pos="1080"/>
+        </w:tabs>
+        <w:ind w:start="1080" w:hanging="360"/>
+      </w:pPr>
+      <w:rPr>
+        <w:rFonts w:ascii="OpenSymbol" w:hAnsi="OpenSymbol" w:cs="OpenSymbol" w:hint="default"/>
+      </w:rPr>
+    </w:lvl>
+    <w:lvl w:ilvl="2">
+      <w:start w:val="1"/>
+      <w:numFmt w:val="bullet"/>
+      <w:lvlText w:val="▪"/>
+      <w:lvlJc w:val="start"/>
+      <w:pPr>
+        <w:tabs>
+          <w:tab w:val="num" w:pos="1440"/>
+        </w:tabs>
+        <w:ind w:start="1440" w:hanging="360"/>
+      </w:pPr>
+      <w:rPr>
+        <w:rFonts w:ascii="OpenSymbol" w:hAnsi="OpenSymbol" w:cs="OpenSymbol" w:hint="default"/>
+      </w:rPr>
+    </w:lvl>
+    <w:lvl w:ilvl="3">
+      <w:start w:val="1"/>
+      <w:numFmt w:val="bullet"/>
+      <w:lvlText w:val=""/>
+      <w:lvlJc w:val="start"/>
+      <w:pPr>
+        <w:tabs>
+          <w:tab w:val="num" w:pos="1800"/>
+        </w:tabs>
+        <w:ind w:start="1800" w:hanging="360"/>
+      </w:pPr>
+      <w:rPr>
+        <w:rFonts w:ascii="Symbol" w:hAnsi="Symbol" w:cs="Symbol" w:hint="default"/>
+      </w:rPr>
+    </w:lvl>
+    <w:lvl w:ilvl="4">
+      <w:start w:val="1"/>
+      <w:numFmt w:val="bullet"/>
+      <w:lvlText w:val="◦"/>
+      <w:lvlJc w:val="start"/>
+      <w:pPr>
+        <w:tabs>
+          <w:tab w:val="num" w:pos="2160"/>
+        </w:tabs>
+        <w:ind w:start="2160" w:hanging="360"/>
+      </w:pPr>
+      <w:rPr>
+        <w:rFonts w:ascii="OpenSymbol" w:hAnsi="OpenSymbol" w:cs="OpenSymbol" w:hint="default"/>
+      </w:rPr>
+    </w:lvl>
+    <w:lvl w:ilvl="5">
+      <w:start w:val="1"/>
+      <w:numFmt w:val="bullet"/>
+      <w:lvlText w:val="▪"/>
+      <w:lvlJc w:val="start"/>
+      <w:pPr>
+        <w:tabs>
+          <w:tab w:val="num" w:pos="2520"/>
+        </w:tabs>
+        <w:ind w:start="2520" w:hanging="360"/>
+      </w:pPr>
+      <w:rPr>
+        <w:rFonts w:ascii="OpenSymbol" w:hAnsi="OpenSymbol" w:cs="OpenSymbol" w:hint="default"/>
+      </w:rPr>
+    </w:lvl>
+    <w:lvl w:ilvl="6">
+      <w:start w:val="1"/>
+      <w:numFmt w:val="bullet"/>
+      <w:lvlText w:val=""/>
+      <w:lvlJc w:val="start"/>
+      <w:pPr>
+        <w:tabs>
+          <w:tab w:val="num" w:pos="2880"/>
+        </w:tabs>
+        <w:ind w:start="2880" w:hanging="360"/>
+      </w:pPr>
+      <w:rPr>
+        <w:rFonts w:ascii="Symbol" w:hAnsi="Symbol" w:cs="Symbol" w:hint="default"/>
+      </w:rPr>
+    </w:lvl>
+    <w:lvl w:ilvl="7">
+      <w:start w:val="1"/>
+      <w:numFmt w:val="bullet"/>
+      <w:lvlText w:val="◦"/>
+      <w:lvlJc w:val="start"/>
+      <w:pPr>
+        <w:tabs>
+          <w:tab w:val="num" w:pos="3240"/>
+        </w:tabs>
+        <w:ind w:start="3240" w:hanging="360"/>
+      </w:pPr>
+      <w:rPr>
+        <w:rFonts w:ascii="OpenSymbol" w:hAnsi="OpenSymbol" w:cs="OpenSymbol" w:hint="default"/>
+      </w:rPr>
+    </w:lvl>
+    <w:lvl w:ilvl="8">
+      <w:start w:val="1"/>
+      <w:numFmt w:val="bullet"/>
+      <w:lvlText w:val="▪"/>
+      <w:lvlJc w:val="start"/>
+      <w:pPr>
+        <w:tabs>
+          <w:tab w:val="num" w:pos="3600"/>
+        </w:tabs>
+        <w:ind w:start="3600" w:hanging="360"/>
+      </w:pPr>
+      <w:rPr>
+        <w:rFonts w:ascii="OpenSymbol" w:hAnsi="OpenSymbol" w:cs="OpenSymbol" w:hint="default"/>
+      </w:rPr>
+    </w:lvl>
+  </w:abstractNum>
+  <w:abstractNum w:abstractNumId="16">
+    <w:lvl w:ilvl="0">
+      <w:start w:val="1"/>
+      <w:numFmt w:val="bullet"/>
+      <w:lvlText w:val=""/>
+      <w:lvlJc w:val="start"/>
+      <w:pPr>
+        <w:tabs>
+          <w:tab w:val="num" w:pos="709"/>
+        </w:tabs>
+        <w:ind w:start="709" w:hanging="283"/>
+      </w:pPr>
+      <w:rPr>
+        <w:rFonts w:ascii="Symbol" w:hAnsi="Symbol" w:cs="Symbol" w:hint="default"/>
+      </w:rPr>
+    </w:lvl>
+    <w:lvl w:ilvl="1">
+      <w:start w:val="1"/>
+      <w:numFmt w:val="bullet"/>
+      <w:lvlText w:val=""/>
+      <w:lvlJc w:val="start"/>
+      <w:pPr>
+        <w:tabs>
+          <w:tab w:val="num" w:pos="1418"/>
+        </w:tabs>
+        <w:ind w:start="1418" w:hanging="283"/>
+      </w:pPr>
+      <w:rPr>
+        <w:rFonts w:ascii="Symbol" w:hAnsi="Symbol" w:cs="Symbol" w:hint="default"/>
+      </w:rPr>
+    </w:lvl>
+    <w:lvl w:ilvl="2">
+      <w:start w:val="1"/>
+      <w:numFmt w:val="bullet"/>
+      <w:lvlText w:val=""/>
+      <w:lvlJc w:val="start"/>
+      <w:pPr>
+        <w:tabs>
+          <w:tab w:val="num" w:pos="2127"/>
+        </w:tabs>
+        <w:ind w:start="2127" w:hanging="283"/>
+      </w:pPr>
+      <w:rPr>
+        <w:rFonts w:ascii="Symbol" w:hAnsi="Symbol" w:cs="Symbol" w:hint="default"/>
+      </w:rPr>
+    </w:lvl>
+    <w:lvl w:ilvl="3">
+      <w:start w:val="1"/>
+      <w:numFmt w:val="bullet"/>
+      <w:lvlText w:val=""/>
+      <w:lvlJc w:val="start"/>
+      <w:pPr>
+        <w:tabs>
+          <w:tab w:val="num" w:pos="2836"/>
+        </w:tabs>
+        <w:ind w:start="2836" w:hanging="283"/>
+      </w:pPr>
+      <w:rPr>
+        <w:rFonts w:ascii="Symbol" w:hAnsi="Symbol" w:cs="Symbol" w:hint="default"/>
+      </w:rPr>
+    </w:lvl>
+    <w:lvl w:ilvl="4">
+      <w:start w:val="1"/>
+      <w:numFmt w:val="bullet"/>
+      <w:lvlText w:val=""/>
+      <w:lvlJc w:val="start"/>
+      <w:pPr>
+        <w:tabs>
+          <w:tab w:val="num" w:pos="3545"/>
+        </w:tabs>
+        <w:ind w:start="3545" w:hanging="283"/>
+      </w:pPr>
+      <w:rPr>
+        <w:rFonts w:ascii="Symbol" w:hAnsi="Symbol" w:cs="Symbol" w:hint="default"/>
+      </w:rPr>
+    </w:lvl>
+    <w:lvl w:ilvl="5">
+      <w:start w:val="1"/>
+      <w:numFmt w:val="bullet"/>
+      <w:lvlText w:val=""/>
+      <w:lvlJc w:val="start"/>
+      <w:pPr>
+        <w:tabs>
+          <w:tab w:val="num" w:pos="4254"/>
+        </w:tabs>
+        <w:ind w:start="4254" w:hanging="283"/>
+      </w:pPr>
+      <w:rPr>
+        <w:rFonts w:ascii="Symbol" w:hAnsi="Symbol" w:cs="Symbol" w:hint="default"/>
+      </w:rPr>
+    </w:lvl>
+    <w:lvl w:ilvl="6">
+      <w:start w:val="1"/>
+      <w:numFmt w:val="bullet"/>
+      <w:lvlText w:val=""/>
+      <w:lvlJc w:val="start"/>
+      <w:pPr>
+        <w:tabs>
+          <w:tab w:val="num" w:pos="4963"/>
+        </w:tabs>
+        <w:ind w:start="4963" w:hanging="283"/>
+      </w:pPr>
+      <w:rPr>
+        <w:rFonts w:ascii="Symbol" w:hAnsi="Symbol" w:cs="Symbol" w:hint="default"/>
+      </w:rPr>
+    </w:lvl>
+    <w:lvl w:ilvl="7">
+      <w:start w:val="1"/>
+      <w:numFmt w:val="bullet"/>
+      <w:lvlText w:val=""/>
+      <w:lvlJc w:val="start"/>
+      <w:pPr>
+        <w:tabs>
+          <w:tab w:val="num" w:pos="5672"/>
+        </w:tabs>
+        <w:ind w:start="5672" w:hanging="283"/>
+      </w:pPr>
+      <w:rPr>
+        <w:rFonts w:ascii="Symbol" w:hAnsi="Symbol" w:cs="Symbol" w:hint="default"/>
+      </w:rPr>
+    </w:lvl>
+    <w:lvl w:ilvl="8">
+      <w:start w:val="1"/>
+      <w:numFmt w:val="bullet"/>
+      <w:lvlText w:val=""/>
+      <w:lvlJc w:val="start"/>
+      <w:pPr>
+        <w:tabs>
+          <w:tab w:val="num" w:pos="6381"/>
+        </w:tabs>
+        <w:ind w:start="6381" w:hanging="283"/>
+      </w:pPr>
+      <w:rPr>
+        <w:rFonts w:ascii="Symbol" w:hAnsi="Symbol" w:cs="Symbol" w:hint="default"/>
+      </w:rPr>
+    </w:lvl>
+  </w:abstractNum>
+  <w:abstractNum w:abstractNumId="17">
     <w:lvl w:ilvl="0">
       <w:start w:val="1"/>
       <w:numFmt w:val="none"/>
@@ -3631,6 +5097,18 @@
   </w:num>
   <w:num w:numId="13">
     <w:abstractNumId w:val="13"/>
+  </w:num>
+  <w:num w:numId="14">
+    <w:abstractNumId w:val="14"/>
+  </w:num>
+  <w:num w:numId="15">
+    <w:abstractNumId w:val="15"/>
+  </w:num>
+  <w:num w:numId="16">
+    <w:abstractNumId w:val="16"/>
+  </w:num>
+  <w:num w:numId="17">
+    <w:abstractNumId w:val="17"/>
   </w:num>
 </w:numbering>
 </file>
@@ -3841,6 +5319,19 @@
       <w:rFonts w:cs="Noto Sans Devanagari"/>
     </w:rPr>
   </w:style>
+  <w:style w:type="paragraph" w:styleId="PreformattedText">
+    <w:name w:val="Preformatted Text"/>
+    <w:basedOn w:val="Normal"/>
+    <w:qFormat/>
+    <w:pPr>
+      <w:spacing w:before="0" w:after="0"/>
+    </w:pPr>
+    <w:rPr>
+      <w:rFonts w:ascii="Liberation Mono" w:hAnsi="Liberation Mono" w:eastAsia="Noto Sans Mono CJK SC" w:cs="Liberation Mono"/>
+      <w:sz w:val="20"/>
+      <w:szCs w:val="20"/>
+    </w:rPr>
+  </w:style>
 </w:styles>
 </file>
 

</xml_diff>